<commit_message>
feat(v3): Task 1 — intake revised sources and archive superseded originals
- Committed the revised secretary desk.docx and Siddhartha Mukhopadhyay story.docx placed by the editor
- Archived the superseded originals (exported from db5b6ab) under 04_MAGAZINE_WORKING/SUPERSEDED_SOURCES/2026-09-14 with a hash README
- Added sprints/v3 (CHANGEV3_SUMMARY, approved PRD, TASKS)
- Tests: 1 integration (archive/live hash verification)
- Security: semgrep clean, npm audit unchanged (4 pre-existing)

Co-Authored-By: Claude Fable 5.1 <noreply@anthropic.com>
Claude-Session: https://claude.ai/code/session_01Uai2kBaFAYKD1QqLxvNUw7
</commit_message>
<xml_diff>
--- a/02_INCOMING_CONTENT/secretary desk.docx
+++ b/02_INCOMING_CONTENT/secretary desk.docx
@@ -1,97 +1,499 @@
 
 <file path=word/document.xml><?xml version="1.0" encoding="utf-8"?>
-<w:document xmlns:wpc="http://schemas.microsoft.com/office/word/2010/wordprocessingCanvas" xmlns:cx="http://schemas.microsoft.com/office/drawing/2014/chartex" xmlns:cx1="http://schemas.microsoft.com/office/drawing/2015/9/8/chartex" xmlns:cx2="http://schemas.microsoft.com/office/drawing/2015/10/21/chartex" xmlns:cx3="http://schemas.microsoft.com/office/drawing/2016/5/9/chartex" xmlns:cx4="http://schemas.microsoft.com/office/drawing/2016/5/10/chartex" xmlns:cx5="http://schemas.microsoft.com/office/drawing/2016/5/11/chartex" xmlns:cx6="http://schemas.microsoft.com/office/drawing/2016/5/12/chartex" xmlns:cx7="http://schemas.microsoft.com/office/drawing/2016/5/13/chartex" xmlns:cx8="http://schemas.microsoft.com/office/drawing/2016/5/14/chartex" xmlns:mc="http://schemas.openxmlformats.org/markup-compatibility/2006" xmlns:aink="http://schemas.microsoft.com/office/drawing/2016/ink" xmlns:am3d="http://schemas.microsoft.com/office/drawing/2017/model3d" xmlns:o="urn:schemas-microsoft-com:office:office" xmlns:oel="http://schemas.microsoft.com/office/2019/extlst" xmlns:r="http://schemas.openxmlformats.org/officeDocument/2006/relationships" xmlns:m="http://schemas.openxmlformats.org/officeDocument/2006/math" xmlns:v="urn:schemas-microsoft-com:vml" xmlns:wp14="http://schemas.microsoft.com/office/word/2010/wordprocessingDrawing" xmlns:wp="http://schemas.openxmlformats.org/drawingml/2006/wordprocessingDrawing" xmlns:w10="urn:schemas-microsoft-com:office:word" xmlns:w="http://schemas.openxmlformats.org/wordprocessingml/2006/main" xmlns:w14="http://schemas.microsoft.com/office/word/2010/wordml" xmlns:w15="http://schemas.microsoft.com/office/word/2012/wordml" xmlns:w16cei="http://schemas.microsoft.com/office/word/2026/wordml/cei" xmlns:w16cex="http://schemas.microsoft.com/office/word/2018/wordml/cex" xmlns:w16cid="http://schemas.microsoft.com/office/word/2016/wordml/cid" xmlns:w16="http://schemas.microsoft.com/office/word/2018/wordml" xmlns:w16du="http://schemas.microsoft.com/office/word/2023/wordml/word16du" xmlns:w16sdtdh="http://schemas.microsoft.com/office/word/2020/wordml/sdtdatahash" xmlns:w16sdtfl="http://schemas.microsoft.com/office/word/2024/wordml/sdtformatlock" xmlns:w16se="http://schemas.microsoft.com/office/word/2015/wordml/symex" xmlns:wpg="http://schemas.microsoft.com/office/word/2010/wordprocessingGroup" xmlns:wpi="http://schemas.microsoft.com/office/word/2010/wordprocessingInk" xmlns:wne="http://schemas.microsoft.com/office/word/2006/wordml" xmlns:wps="http://schemas.microsoft.com/office/word/2010/wordprocessingShape" mc:Ignorable="w14 w15 w16se w16cid w16 w16cex w16sdtdh w16sdtfl w16du wp14">
+<w:document xmlns:wpc="http://schemas.microsoft.com/office/word/2010/wordprocessingCanvas" xmlns:cx="http://schemas.microsoft.com/office/drawing/2014/chartex" xmlns:cx1="http://schemas.microsoft.com/office/drawing/2015/9/8/chartex" xmlns:cx2="http://schemas.microsoft.com/office/drawing/2015/10/21/chartex" xmlns:cx3="http://schemas.microsoft.com/office/drawing/2016/5/9/chartex" xmlns:cx4="http://schemas.microsoft.com/office/drawing/2016/5/10/chartex" xmlns:cx5="http://schemas.microsoft.com/office/drawing/2016/5/11/chartex" xmlns:cx6="http://schemas.microsoft.com/office/drawing/2016/5/12/chartex" xmlns:cx7="http://schemas.microsoft.com/office/drawing/2016/5/13/chartex" xmlns:cx8="http://schemas.microsoft.com/office/drawing/2016/5/14/chartex" xmlns:mc="http://schemas.openxmlformats.org/markup-compatibility/2006" xmlns:aink="http://schemas.microsoft.com/office/drawing/2016/ink" xmlns:am3d="http://schemas.microsoft.com/office/drawing/2017/model3d" xmlns:o="urn:schemas-microsoft-com:office:office" xmlns:oel="http://schemas.microsoft.com/office/2019/extlst" xmlns:r="http://schemas.openxmlformats.org/officeDocument/2006/relationships" xmlns:m="http://schemas.openxmlformats.org/officeDocument/2006/math" xmlns:v="urn:schemas-microsoft-com:vml" xmlns:wp14="http://schemas.microsoft.com/office/word/2010/wordprocessingDrawing" xmlns:wp="http://schemas.openxmlformats.org/drawingml/2006/wordprocessingDrawing" xmlns:w10="urn:schemas-microsoft-com:office:word" xmlns:w="http://schemas.openxmlformats.org/wordprocessingml/2006/main" xmlns:w14="http://schemas.microsoft.com/office/word/2010/wordml" xmlns:w15="http://schemas.microsoft.com/office/word/2012/wordml" xmlns:w16cex="http://schemas.microsoft.com/office/word/2018/wordml/cex" xmlns:w16cid="http://schemas.microsoft.com/office/word/2016/wordml/cid" xmlns:w16="http://schemas.microsoft.com/office/word/2018/wordml" xmlns:w16du="http://schemas.microsoft.com/office/word/2023/wordml/word16du" xmlns:w16sdtdh="http://schemas.microsoft.com/office/word/2020/wordml/sdtdatahash" xmlns:w16sdtfl="http://schemas.microsoft.com/office/word/2024/wordml/sdtformatlock" xmlns:w16se="http://schemas.microsoft.com/office/word/2015/wordml/symex" xmlns:wpg="http://schemas.microsoft.com/office/word/2010/wordprocessingGroup" xmlns:wpi="http://schemas.microsoft.com/office/word/2010/wordprocessingInk" xmlns:wne="http://schemas.microsoft.com/office/word/2006/wordml" xmlns:wps="http://schemas.microsoft.com/office/word/2010/wordprocessingShape" mc:Ignorable="w14 w15 w16se w16cid w16 w16cex w16sdtdh w16sdtfl w16du wp14">
   <w:body>
     <w:p>
       <w:pPr>
         <w:rPr>
           <w:b/>
           <w:bCs/>
+          <w:color w:val="000000" w:themeColor="text1"/>
+          <w:sz w:val="32"/>
+          <w:szCs w:val="36"/>
+          <w:lang w:val="en-GB"/>
         </w:rPr>
       </w:pPr>
       <w:r>
         <w:rPr>
           <w:b/>
           <w:bCs/>
-        </w:rPr>
-        <w:t>Secretary’s Desk</w:t>
-      </w:r>
-    </w:p>
-    <w:p>
-      <w:r>
-        <w:t>It is a privilege and a great responsibility to serve as Secretary of BECAA Maharashtra. For all of us, Bengal Engineering College is much more than an institution where we studied. It is where lifelong friendships were formed, ideas took shape, and many of the values that continue to guide us were nurtured.</w:t>
-      </w:r>
-    </w:p>
-    <w:p>
-      <w:r>
-        <w:t>Even after so many years, memories of the campus remain fresh. The mention of Sengupta Hall brings back the warmth of hostel life, the companionship of friends and the simple moments that made our college days unforgettable. Although our careers and responsibilities have taken us to different places, our shared connection with our alma mater continues to bring us together.</w:t>
-      </w:r>
-    </w:p>
-    <w:p>
-      <w:r>
-        <w:t xml:space="preserve">During the past year, BECAA Maharashtra has remained active in strengthening this bond. </w:t>
-      </w:r>
-      <w:r>
-        <w:rPr>
+          <w:color w:val="000000" w:themeColor="text1"/>
+          <w:sz w:val="32"/>
+          <w:szCs w:val="36"/>
+          <w:lang w:val="en-GB"/>
+        </w:rPr>
+        <w:t>From the Secretary's Desk</w:t>
+      </w:r>
+    </w:p>
+    <w:p>
+      <w:pPr>
+        <w:jc w:val="both"/>
+        <w:rPr>
+          <w:szCs w:val="32"/>
+          <w:lang w:val="en-GB"/>
+        </w:rPr>
+      </w:pPr>
+      <w:r>
+        <w:rPr>
+          <w:szCs w:val="32"/>
+          <w:lang w:val="en-GB"/>
+        </w:rPr>
+        <w:t>It is both an honour and a privilege to serve as the Secretary of BECAA Maharashtra.</w:t>
+      </w:r>
+    </w:p>
+    <w:p>
+      <w:pPr>
+        <w:jc w:val="both"/>
+        <w:rPr>
+          <w:szCs w:val="32"/>
+          <w:lang w:val="en-GB"/>
+        </w:rPr>
+      </w:pPr>
+      <w:r>
+        <w:rPr>
+          <w:szCs w:val="32"/>
+          <w:lang w:val="en-GB"/>
+        </w:rPr>
+        <w:t xml:space="preserve">For each one of us, Bengal Engineering College, now IIEST </w:t>
+      </w:r>
+      <w:proofErr w:type="spellStart"/>
+      <w:r>
+        <w:rPr>
+          <w:szCs w:val="32"/>
+          <w:lang w:val="en-GB"/>
+        </w:rPr>
+        <w:t>Shibpur</w:t>
+      </w:r>
+      <w:proofErr w:type="spellEnd"/>
+      <w:r>
+        <w:rPr>
+          <w:szCs w:val="32"/>
+          <w:lang w:val="en-GB"/>
+        </w:rPr>
+        <w:t>, is far more than the institution where we received our education. It is where lifelong friendships were forged, dreams took shape, and values were nurtured that continue to guide us through life and career.</w:t>
+      </w:r>
+    </w:p>
+    <w:p>
+      <w:pPr>
+        <w:jc w:val="both"/>
+        <w:rPr>
+          <w:b/>
+          <w:bCs/>
+          <w:szCs w:val="32"/>
+          <w:lang w:val="en-GB"/>
+        </w:rPr>
+      </w:pPr>
+      <w:r>
+        <w:rPr>
+          <w:b/>
+          <w:bCs/>
           <w:i/>
           <w:iCs/>
+          <w:szCs w:val="32"/>
+          <w:lang w:val="en-GB"/>
+        </w:rPr>
+        <w:t>“BECAA Maharashtra is more than an alumni association. It is a family united by shared memories, common values, and a commitment to carry our legacy forward.”</w:t>
+      </w:r>
+    </w:p>
+    <w:p>
+      <w:pPr>
+        <w:jc w:val="both"/>
+        <w:rPr>
+          <w:szCs w:val="32"/>
+          <w:lang w:val="en-GB"/>
+        </w:rPr>
+      </w:pPr>
+      <w:r>
+        <w:rPr>
+          <w:szCs w:val="32"/>
+          <w:lang w:val="en-GB"/>
+        </w:rPr>
+        <w:t>Even after decades, our memories of the campus remain vivid. The mere mention of our Halls and hostel numbers instantly transports us back to those cherished days of friendship, late-night discussions, cultural activities, academic pursuits, and countless shared experiences. Life may have taken us along different paths and to different corners of the world, but the bond we share with our alma mater remains as strong as ever.</w:t>
+      </w:r>
+    </w:p>
+    <w:p>
+      <w:pPr>
+        <w:jc w:val="both"/>
+        <w:rPr>
+          <w:szCs w:val="32"/>
+          <w:lang w:val="en-GB"/>
+        </w:rPr>
+      </w:pPr>
+      <w:r>
+        <w:rPr>
+          <w:szCs w:val="32"/>
+          <w:lang w:val="en-GB"/>
+        </w:rPr>
+        <w:t>One of the greatest strengths of BECAA Maharashtra is its ability to keep this bond alive across generations. Over the past year, we have continued this tradition through a variety of cultural, social, and community-driven initiatives.</w:t>
+      </w:r>
+    </w:p>
+    <w:p>
+      <w:pPr>
+        <w:jc w:val="both"/>
+        <w:rPr>
+          <w:szCs w:val="32"/>
+          <w:lang w:val="en-GB"/>
+        </w:rPr>
+      </w:pPr>
+      <w:r>
+        <w:rPr>
+          <w:szCs w:val="32"/>
+          <w:lang w:val="en-GB"/>
+        </w:rPr>
+        <w:t xml:space="preserve">Our flagship cultural event, </w:t>
+      </w:r>
+      <w:r>
+        <w:rPr>
+          <w:i/>
+          <w:iCs/>
+          <w:szCs w:val="32"/>
+          <w:lang w:val="en-GB"/>
         </w:rPr>
         <w:t>Swar Setu</w:t>
       </w:r>
       <w:r>
-        <w:t>, our cultural programme featuring Madhubanti Bagchi and Jazim Sharma, brought alumni, families and well-wishers together through music while supporting a meaningful cause. Our Bijoya Sammilani and annual picnic provided further opportunities to renew old friendships, welcome families and enjoy the fellowship that lies at the heart of our association. Such occasions remind us that BECAA is not merely an organisation. It is an extended family.</w:t>
-      </w:r>
-    </w:p>
-    <w:p>
-      <w:r>
-        <w:t>Alongside these cultural and social gatherings, our association remains committed to its wider responsibilities. Supporting education, helping members during medical need and contributing to appropriate social-welfare initiatives are important parts of our purpose. We also hope to expand technical and educational activities, encourage the exchange of knowledge and develop stronger connections with academic institutions.</w:t>
-      </w:r>
-    </w:p>
-    <w:p>
-      <w:r>
-        <w:t>The future strength of BECAA Maharashtra will depend on the active participation of its members. I particularly invite younger alumni and those who have recently made Maharashtra their home to join our programmes, share their ideas and take part in the association’s work. Their energy and fresh perspectives will help us carry our legacy forward.</w:t>
-      </w:r>
-    </w:p>
-    <w:p>
-      <w:r>
-        <w:t>I offer my sincere gratitude to our members, volunteers, patrons, sponsors and their families. Every programme and initiative becomes possible because people contribute their time, effort, experience and goodwill.</w:t>
-      </w:r>
-    </w:p>
-    <w:p>
-      <w:r>
-        <w:t>Let us continue to preserve the friendships and values we inherited from our college while working together for education, service and fellowship. May BECAA Maharashtra remain a welcoming platform where generations of alumni can reconnect with one another and keep the spirit of our alma mater alive.</w:t>
-      </w:r>
-    </w:p>
-    <w:p>
-      <w:r>
+        <w:rPr>
+          <w:szCs w:val="32"/>
+          <w:lang w:val="en-GB"/>
+        </w:rPr>
+        <w:t xml:space="preserve">, featuring acclaimed artists </w:t>
+      </w:r>
+      <w:proofErr w:type="spellStart"/>
+      <w:r>
+        <w:rPr>
+          <w:szCs w:val="32"/>
+          <w:lang w:val="en-GB"/>
+        </w:rPr>
+        <w:t>Madhubanti</w:t>
+      </w:r>
+      <w:proofErr w:type="spellEnd"/>
+      <w:r>
+        <w:rPr>
+          <w:szCs w:val="32"/>
+          <w:lang w:val="en-GB"/>
+        </w:rPr>
+        <w:t xml:space="preserve"> Bagchi and Jazim Sharma, brought together alumni, families, and friends for an unforgettable evening of music while supporting a meaningful social cause. Our Bijoya </w:t>
+      </w:r>
+      <w:proofErr w:type="spellStart"/>
+      <w:r>
+        <w:rPr>
+          <w:szCs w:val="32"/>
+          <w:lang w:val="en-GB"/>
+        </w:rPr>
+        <w:t>Sammilani</w:t>
+      </w:r>
+      <w:proofErr w:type="spellEnd"/>
+      <w:r>
+        <w:rPr>
+          <w:szCs w:val="32"/>
+          <w:lang w:val="en-GB"/>
+        </w:rPr>
+        <w:t xml:space="preserve"> and Annual Picnic provided wonderful opportunities to reconnect with old friends, welcome new members and their families, and celebrate the spirit of togetherness that defines our association.</w:t>
+      </w:r>
+    </w:p>
+    <w:p>
+      <w:pPr>
+        <w:jc w:val="both"/>
+        <w:rPr>
+          <w:szCs w:val="32"/>
+          <w:lang w:val="en-GB"/>
+        </w:rPr>
+      </w:pPr>
+      <w:r>
+        <w:rPr>
+          <w:szCs w:val="32"/>
+          <w:lang w:val="en-GB"/>
+        </w:rPr>
+        <w:t>These gatherings reaffirm an important truth: BECAA Maharashtra is not merely an alumni association. It is an extended family united by shared memories, common values, and an enduring affection for our alma mater.</w:t>
+      </w:r>
+    </w:p>
+    <w:p>
+      <w:pPr>
+        <w:jc w:val="both"/>
+        <w:rPr>
+          <w:szCs w:val="32"/>
+          <w:lang w:val="en-GB"/>
+        </w:rPr>
+      </w:pPr>
+      <w:r>
+        <w:rPr>
+          <w:szCs w:val="32"/>
+          <w:lang w:val="en-GB"/>
+        </w:rPr>
+        <w:t>Beyond social and cultural engagement, we remain committed to our broader responsibilities. Supporting education, extending assistance to members during times of need, and contributing to meaningful social welfare initiatives continue to be central to our mission. Looking ahead, we aspire to expand our educational and technical activities, encourage greater knowledge sharing among alumni, and strengthen our engagement with students and academic institutions.</w:t>
+      </w:r>
+    </w:p>
+    <w:p>
+      <w:pPr>
+        <w:jc w:val="both"/>
+        <w:rPr>
+          <w:szCs w:val="32"/>
+          <w:lang w:val="en-GB"/>
+        </w:rPr>
+      </w:pPr>
+      <w:r>
+        <w:rPr>
+          <w:szCs w:val="32"/>
+          <w:lang w:val="en-GB"/>
+        </w:rPr>
+        <w:t xml:space="preserve">The future of BECAA Maharashtra depends upon the active participation of its members and the infusion of fresh ideas from younger generations. I warmly invite young alumni, as well as those who have recently made Maharashtra their home, to become actively involved in our activities, contribute their perspectives, and help shape the next chapter </w:t>
+      </w:r>
+      <w:r>
+        <w:rPr>
+          <w:szCs w:val="32"/>
+          <w:lang w:val="en-GB"/>
+        </w:rPr>
+        <w:lastRenderedPageBreak/>
+        <w:t>of our journey. Their enthusiasm, energy, and innovation will play a vital role in carrying our legacy forward.</w:t>
+      </w:r>
+    </w:p>
+    <w:p>
+      <w:pPr>
+        <w:jc w:val="both"/>
+        <w:rPr>
+          <w:szCs w:val="32"/>
+          <w:lang w:val="en-GB"/>
+        </w:rPr>
+      </w:pPr>
+      <w:r>
+        <w:rPr>
+          <w:szCs w:val="32"/>
+          <w:lang w:val="en-GB"/>
+        </w:rPr>
+        <w:t>I extend my heartfelt gratitude to our members, volunteers, patrons, sponsors, and their families. Every programme, initiative, and achievement of our association is made possible through their dedication, support, and generosity.</w:t>
+      </w:r>
+    </w:p>
+    <w:p>
+      <w:pPr>
+        <w:jc w:val="both"/>
+        <w:rPr>
+          <w:szCs w:val="32"/>
+          <w:lang w:val="en-GB"/>
+        </w:rPr>
+      </w:pPr>
+      <w:r>
+        <w:rPr>
+          <w:szCs w:val="32"/>
+          <w:lang w:val="en-GB"/>
+        </w:rPr>
+        <w:t xml:space="preserve">As we look ahead, let us continue to cherish the friendships and values that we inherited from our college days while working together in the spirit of service, learning, and fellowship. </w:t>
+      </w:r>
+    </w:p>
+    <w:p>
+      <w:pPr>
+        <w:jc w:val="both"/>
+        <w:rPr>
+          <w:szCs w:val="32"/>
+          <w:lang w:val="en-GB"/>
+        </w:rPr>
+      </w:pPr>
+      <w:r>
+        <w:rPr>
+          <w:szCs w:val="32"/>
+          <w:lang w:val="en-GB"/>
+        </w:rPr>
+        <w:t xml:space="preserve">May BECAA Maharashtra continue to serve as a vibrant platform where generations of alumni can connect, collaborate, and celebrate the enduring legacy of Bengal Engineering College and IIEST </w:t>
+      </w:r>
+      <w:proofErr w:type="spellStart"/>
+      <w:r>
+        <w:rPr>
+          <w:szCs w:val="32"/>
+          <w:lang w:val="en-GB"/>
+        </w:rPr>
+        <w:t>Shibpur</w:t>
+      </w:r>
+      <w:proofErr w:type="spellEnd"/>
+      <w:r>
+        <w:rPr>
+          <w:szCs w:val="32"/>
+          <w:lang w:val="en-GB"/>
+        </w:rPr>
+        <w:t>.</w:t>
+      </w:r>
+    </w:p>
+    <w:p>
+      <w:pPr>
+        <w:jc w:val="both"/>
+        <w:rPr>
+          <w:szCs w:val="32"/>
+          <w:lang w:val="en-GB"/>
+        </w:rPr>
+      </w:pPr>
+      <w:r>
+        <w:rPr>
+          <w:szCs w:val="32"/>
+          <w:lang w:val="en-GB"/>
+        </w:rPr>
+        <w:t>With warm regards,</w:t>
+      </w:r>
+    </w:p>
+    <w:p>
+      <w:pPr>
+        <w:jc w:val="both"/>
         <w:rPr>
           <w:b/>
           <w:bCs/>
-        </w:rPr>
-        <w:t>Abir Banerjee</w:t>
-      </w:r>
-      <w:r>
-        <w:br/>
-      </w:r>
-      <w:r>
+          <w:szCs w:val="32"/>
+          <w:lang w:val="en-GB"/>
+        </w:rPr>
+      </w:pPr>
+      <w:r>
+        <w:rPr>
+          <w:rFonts w:ascii="Futura Lt" w:hAnsi="Futura Lt"/>
+          <w:b/>
+          <w:noProof/>
+          <w:szCs w:val="32"/>
+          <w:lang w:val="en-US"/>
+        </w:rPr>
+        <w:drawing>
+          <wp:inline distT="0" distB="0" distL="0" distR="0" wp14:anchorId="08B3C070" wp14:editId="106AEB67">
+            <wp:extent cx="863600" cy="346506"/>
+            <wp:effectExtent l="0" t="0" r="0" b="0"/>
+            <wp:docPr id="2" name="Picture 1"/>
+            <wp:cNvGraphicFramePr>
+              <a:graphicFrameLocks xmlns:a="http://schemas.openxmlformats.org/drawingml/2006/main" noChangeAspect="1"/>
+            </wp:cNvGraphicFramePr>
+            <a:graphic xmlns:a="http://schemas.openxmlformats.org/drawingml/2006/main">
+              <a:graphicData uri="http://schemas.openxmlformats.org/drawingml/2006/picture">
+                <pic:pic xmlns:pic="http://schemas.openxmlformats.org/drawingml/2006/picture">
+                  <pic:nvPicPr>
+                    <pic:cNvPr id="0" name="Picture 1"/>
+                    <pic:cNvPicPr>
+                      <a:picLocks noChangeAspect="1" noChangeArrowheads="1"/>
+                    </pic:cNvPicPr>
+                  </pic:nvPicPr>
+                  <pic:blipFill>
+                    <a:blip r:embed="rId4">
+                      <a:extLst>
+                        <a:ext uri="{28A0092B-C50C-407E-A947-70E740481C1C}">
+                          <a14:useLocalDpi xmlns:a14="http://schemas.microsoft.com/office/drawing/2010/main" val="0"/>
+                        </a:ext>
+                      </a:extLst>
+                    </a:blip>
+                    <a:srcRect/>
+                    <a:stretch>
+                      <a:fillRect/>
+                    </a:stretch>
+                  </pic:blipFill>
+                  <pic:spPr bwMode="auto">
+                    <a:xfrm>
+                      <a:off x="0" y="0"/>
+                      <a:ext cx="869776" cy="348984"/>
+                    </a:xfrm>
+                    <a:prstGeom prst="rect">
+                      <a:avLst/>
+                    </a:prstGeom>
+                    <a:noFill/>
+                    <a:ln>
+                      <a:noFill/>
+                    </a:ln>
+                  </pic:spPr>
+                </pic:pic>
+              </a:graphicData>
+            </a:graphic>
+          </wp:inline>
+        </w:drawing>
+      </w:r>
+    </w:p>
+    <w:p>
+      <w:pPr>
+        <w:jc w:val="both"/>
         <w:rPr>
           <w:b/>
           <w:bCs/>
-        </w:rPr>
-        <w:t>ETC ’92</w:t>
-      </w:r>
-      <w:r>
-        <w:br/>
-      </w:r>
+          <w:szCs w:val="32"/>
+          <w:lang w:val="en-GB"/>
+        </w:rPr>
+      </w:pPr>
       <w:r>
         <w:rPr>
           <w:b/>
           <w:bCs/>
-        </w:rPr>
-        <w:t>Secretary, BECAA Maharashtra</w:t>
-      </w:r>
-    </w:p>
-    <w:p/>
+          <w:szCs w:val="32"/>
+          <w:lang w:val="en-GB"/>
+        </w:rPr>
+        <w:t>Abir Banerjee</w:t>
+      </w:r>
+    </w:p>
+    <w:p>
+      <w:pPr>
+        <w:jc w:val="both"/>
+        <w:rPr>
+          <w:i/>
+          <w:iCs/>
+          <w:szCs w:val="32"/>
+          <w:lang w:val="en-GB"/>
+        </w:rPr>
+      </w:pPr>
+      <w:r>
+        <w:rPr>
+          <w:i/>
+          <w:iCs/>
+          <w:szCs w:val="32"/>
+          <w:lang w:val="en-GB"/>
+        </w:rPr>
+        <w:t>ETC '92</w:t>
+      </w:r>
+    </w:p>
+    <w:p>
+      <w:pPr>
+        <w:jc w:val="both"/>
+        <w:rPr>
+          <w:szCs w:val="32"/>
+          <w:lang w:val="en-GB"/>
+        </w:rPr>
+      </w:pPr>
+      <w:r>
+        <w:rPr>
+          <w:b/>
+          <w:bCs/>
+          <w:szCs w:val="32"/>
+          <w:lang w:val="en-GB"/>
+        </w:rPr>
+        <w:t>S</w:t>
+      </w:r>
+      <w:r>
+        <w:rPr>
+          <w:b/>
+          <w:bCs/>
+          <w:szCs w:val="32"/>
+          <w:lang w:val="en-GB"/>
+        </w:rPr>
+        <w:t>ecretary</w:t>
+      </w:r>
+      <w:r>
+        <w:rPr>
+          <w:szCs w:val="32"/>
+          <w:lang w:val="en-GB"/>
+        </w:rPr>
+        <w:br/>
+      </w:r>
+      <w:r>
+        <w:rPr>
+          <w:b/>
+          <w:bCs/>
+          <w:szCs w:val="32"/>
+          <w:lang w:val="en-GB"/>
+        </w:rPr>
+        <w:t>BECAA Maharashtra</w:t>
+      </w:r>
+    </w:p>
+    <w:p>
+      <w:pPr>
+        <w:rPr>
+          <w:sz w:val="32"/>
+          <w:szCs w:val="36"/>
+        </w:rPr>
+      </w:pPr>
+    </w:p>
+    <w:p>
+      <w:pPr>
+        <w:rPr>
+          <w:sz w:val="32"/>
+          <w:szCs w:val="36"/>
+        </w:rPr>
+      </w:pPr>
+    </w:p>
     <w:sectPr>
       <w:pgSz w:w="11906" w:h="16838"/>
       <w:pgMar w:top="1440" w:right="1440" w:bottom="1440" w:left="1440" w:header="708" w:footer="708" w:gutter="0"/>

</xml_diff>